<commit_message>
Add correct phone number to all CVs
Co-Authored-By: Claude Opus 5.5 <noreply@anthropic.com>
Claude-Session: https://claude.ai/code/session_01JCrzMJoLnbHnn3YThRBUsm
</commit_message>
<xml_diff>
--- a/Kasib/Kasib_Cassim_CV_BD_Sales.docx
+++ b/Kasib/Kasib_Cassim_CV_BD_Sales.docx
@@ -60,7 +60,7 @@
         </w:rPr>
         <w:t xml:space="preserve">  |  </w:t>
       </w:r>
-      <w:hyperlink w:history="1" r:id="rIdir843wxsdifumkfxidesv">
+      <w:hyperlink w:history="1" r:id="rId1uz5o0ifrhkk6eogsyzvj">
         <w:r>
           <w:rPr>
             <w:rFonts w:ascii="Calibri" w:cs="Calibri" w:eastAsia="Calibri" w:hAnsi="Calibri"/>
@@ -86,10 +86,8 @@
           <w:color w:val="1A1A1A"/>
           <w:sz w:val="20"/>
           <w:szCs w:val="20"/>
-          <w:highlight w:val="yellow"/>
-          <w:highlightCs w:val="yellow"/>
-        </w:rPr>
-        <w:t xml:space="preserve">+971 56 406 165</w:t>
+        </w:rPr>
+        <w:t xml:space="preserve">+971 56 540 6165</w:t>
       </w:r>
     </w:p>
     <w:p>
@@ -97,7 +95,7 @@
         <w:spacing w:after="40"/>
         <w:jc w:val="center"/>
       </w:pPr>
-      <w:hyperlink w:history="1" r:id="rId29ypunxvp9-wp5eclefdl">
+      <w:hyperlink w:history="1" r:id="rId54c-leaa_k0xqudiwjbrb">
         <w:r>
           <w:rPr>
             <w:rFonts w:ascii="Calibri" w:cs="Calibri" w:eastAsia="Calibri" w:hAnsi="Calibri"/>

</xml_diff>

<commit_message>
Remove write-up link placeholder from GTM Engineer CV
Co-Authored-By: Claude Opus 5.5 <noreply@anthropic.com>
Claude-Session: https://claude.ai/code/session_01JCrzMJoLnbHnn3YThRBUsm
</commit_message>
<xml_diff>
--- a/Kasib/Kasib_Cassim_CV_BD_Sales.docx
+++ b/Kasib/Kasib_Cassim_CV_BD_Sales.docx
@@ -60,7 +60,7 @@
         </w:rPr>
         <w:t xml:space="preserve">  |  </w:t>
       </w:r>
-      <w:hyperlink w:history="1" r:id="rId1uz5o0ifrhkk6eogsyzvj">
+      <w:hyperlink w:history="1" r:id="rIdlifmaz-5tl-dxcdwfdv8_">
         <w:r>
           <w:rPr>
             <w:rFonts w:ascii="Calibri" w:cs="Calibri" w:eastAsia="Calibri" w:hAnsi="Calibri"/>
@@ -95,7 +95,7 @@
         <w:spacing w:after="40"/>
         <w:jc w:val="center"/>
       </w:pPr>
-      <w:hyperlink w:history="1" r:id="rId54c-leaa_k0xqudiwjbrb">
+      <w:hyperlink w:history="1" r:id="rId1uqsxlqcmjgp3ratx865p">
         <w:r>
           <w:rPr>
             <w:rFonts w:ascii="Calibri" w:cs="Calibri" w:eastAsia="Calibri" w:hAnsi="Calibri"/>

</xml_diff>